<commit_message>
Erweiterte Felder + strukturiertes Dokument-Beispiel
- salary_info und reference_number als optionale Felder ergänzt
- Beispiel mit gut strukturiertem Kundendokument als Input hinzugefügt
- README um Motivation-Abschnitt ergänzt
</commit_message>
<xml_diff>
--- a/examples/example_output_avionik.docx
+++ b/examples/example_output_avionik.docx
@@ -418,78 +418,6 @@
     </w:p>
     <w:p>
       <w:pPr>
-        <w:pStyle w:val="ListParagraph"/>
-        <w:numPr>
-          <w:ilvl w:val="0"/>
-          <w:numId w:val="2"/>
-        </w:numPr>
-      </w:pPr>
-      <w:r>
-        <w:t xml:space="preserve">Bereitschaft zu 2-Schicht-Arbeit</w:t>
-      </w:r>
-    </w:p>
-    <w:p>
-      <w:r>
-        <w:rPr>
-          <w:i/>
-          <w:iCs/>
-          <w:color w:val="CCCCCC"/>
-          <w:sz w:val="14"/>
-          <w:szCs w:val="14"/>
-        </w:rPr>
-        <w:t xml:space="preserve"/>
-      </w:r>
-    </w:p>
-    <w:p>
-      <w:pPr>
-        <w:pStyle w:val="ListParagraph"/>
-        <w:numPr>
-          <w:ilvl w:val="0"/>
-          <w:numId w:val="2"/>
-        </w:numPr>
-      </w:pPr>
-      <w:r>
-        <w:t xml:space="preserve">Reisebereitschaft innerhalb Deutschlands (ca. 20%)</w:t>
-      </w:r>
-    </w:p>
-    <w:p>
-      <w:r>
-        <w:rPr>
-          <w:i/>
-          <w:iCs/>
-          <w:color w:val="CCCCCC"/>
-          <w:sz w:val="14"/>
-          <w:szCs w:val="14"/>
-        </w:rPr>
-        <w:t xml:space="preserve"/>
-      </w:r>
-    </w:p>
-    <w:p>
-      <w:pPr>
-        <w:pStyle w:val="ListParagraph"/>
-        <w:numPr>
-          <w:ilvl w:val="0"/>
-          <w:numId w:val="2"/>
-        </w:numPr>
-      </w:pPr>
-      <w:r>
-        <w:t xml:space="preserve">Teamlead-Erfahrung von Vorteil, aber keine Voraussetzung</w:t>
-      </w:r>
-    </w:p>
-    <w:p>
-      <w:r>
-        <w:rPr>
-          <w:i/>
-          <w:iCs/>
-          <w:color w:val="CCCCCC"/>
-          <w:sz w:val="14"/>
-          <w:szCs w:val="14"/>
-        </w:rPr>
-        <w:t xml:space="preserve"/>
-      </w:r>
-    </w:p>
-    <w:p>
-      <w:pPr>
         <w:spacing w:after="120" w:before="260"/>
       </w:pPr>
       <w:r>

</xml_diff>